<commit_message>
docs(week6): close out eval, auth docs, and project README
Fill 40/40 assisted FP/miss notes; sync SRS/SDS/progress/plan DOCX; embed Week 6 validation logs and Figma assets in the progress report; polish SMTP/any-domain auth UX; move helpers under scripts/; refresh README project structure for the noor Week 6 MVP.

Co-authored-by: Cursor <cursoragent@cursor.com>
</commit_message>
<xml_diff>
--- a/docs/week6/evaluation_sheet.docx
+++ b/docs/week6/evaluation_sheet.docx
@@ -5,54 +5,114 @@
     <w:p>
       <w:pPr>
         <w:pStyle w:val="Heading1"/>
+        <w:jc w:val="center"/>
       </w:pPr>
       <w:r>
-        <w:t>Week 6 evaluation sheet (40 screens)</w:t>
+        <w:t>Week 6 Evaluation Sheet (40 screens)</w:t>
       </w:r>
     </w:p>
     <w:p>
       <w:r>
         <w:rPr>
+          <w:rFonts w:ascii="Calibri" w:hAnsi="Calibri" w:eastAsia="Calibri"/>
           <w:b/>
+          <w:sz w:val="22"/>
         </w:rPr>
         <w:t>Owner:</w:t>
       </w:r>
       <w:r>
-        <w:t xml:space="preserve"> Muhammad Noor</w:t>
+        <w:rPr>
+          <w:rFonts w:ascii="Calibri" w:hAnsi="Calibri" w:eastAsia="Calibri"/>
+          <w:b w:val="0"/>
+          <w:sz w:val="22"/>
+        </w:rPr>
+        <w:t xml:space="preserve"> Muhammad Noor (</w:t>
+      </w:r>
+      <w:r>
+        <w:rPr>
+          <w:rFonts w:ascii="Consolas" w:hAnsi="Consolas" w:eastAsia="Consolas"/>
+          <w:b w:val="0"/>
+          <w:color w:val="1E3A5F"/>
+          <w:sz w:val="18"/>
+        </w:rPr>
+        <w:t>noor</w:t>
+      </w:r>
+      <w:r>
+        <w:rPr>
+          <w:rFonts w:ascii="Calibri" w:hAnsi="Calibri" w:eastAsia="Calibri"/>
+          <w:b w:val="0"/>
+          <w:sz w:val="22"/>
+        </w:rPr>
+        <w:t>)</w:t>
       </w:r>
     </w:p>
     <w:p>
       <w:r>
         <w:rPr>
+          <w:rFonts w:ascii="Calibri" w:hAnsi="Calibri" w:eastAsia="Calibri"/>
           <w:b/>
+          <w:sz w:val="22"/>
         </w:rPr>
-        <w:t>Branch:</w:t>
-      </w:r>
-      <w:r>
-        <w:t xml:space="preserve"> </w:t>
+        <w:t>Status:</w:t>
       </w:r>
       <w:r>
         <w:rPr>
-          <w:rFonts w:ascii="Consolas" w:hAnsi="Consolas"/>
+          <w:rFonts w:ascii="Calibri" w:hAnsi="Calibri" w:eastAsia="Calibri"/>
+          <w:b w:val="0"/>
+          <w:sz w:val="22"/>
         </w:rPr>
-        <w:t>noor</w:t>
+        <w:t xml:space="preserve"> manual review complete for </w:t>
+      </w:r>
+      <w:r>
+        <w:rPr>
+          <w:rFonts w:ascii="Calibri" w:hAnsi="Calibri" w:eastAsia="Calibri"/>
+          <w:b/>
+          <w:sz w:val="22"/>
+        </w:rPr>
+        <w:t>40/40</w:t>
+      </w:r>
+      <w:r>
+        <w:rPr>
+          <w:rFonts w:ascii="Calibri" w:hAnsi="Calibri" w:eastAsia="Calibri"/>
+          <w:b w:val="0"/>
+          <w:sz w:val="22"/>
+        </w:rPr>
+        <w:t xml:space="preserve"> screens (full stratified sample)</w:t>
       </w:r>
     </w:p>
     <w:p>
       <w:r>
         <w:rPr>
+          <w:rFonts w:ascii="Calibri" w:hAnsi="Calibri" w:eastAsia="Calibri"/>
           <w:b/>
+          <w:sz w:val="22"/>
         </w:rPr>
-        <w:t>CSV:</w:t>
-      </w:r>
-      <w:r>
-        <w:t xml:space="preserve"> </w:t>
+        <w:t>Related Week 6 work:</w:t>
       </w:r>
       <w:r>
         <w:rPr>
-          <w:rFonts w:ascii="Consolas" w:hAnsi="Consolas"/>
+          <w:rFonts w:ascii="Calibri" w:hAnsi="Calibri" w:eastAsia="Calibri"/>
+          <w:b w:val="0"/>
+          <w:sz w:val="22"/>
         </w:rPr>
-        <w:t>docs/week6/evaluation_sheet_40_screens.csv</w:t>
+        <w:t xml:space="preserve"> auth (signup / login / forgot / OTP / reset / Google OAuth), SMTP mail, Records, report export fixes — see also </w:t>
+      </w:r>
+      <w:r>
+        <w:rPr>
+          <w:rFonts w:ascii="Consolas" w:hAnsi="Consolas" w:eastAsia="Consolas"/>
+          <w:b w:val="0"/>
+          <w:color w:val="1E3A5F"/>
+          <w:sz w:val="18"/>
+        </w:rPr>
+        <w:t>updated_plan.md</w:t>
+      </w:r>
+      <w:r>
+        <w:rPr>
+          <w:rFonts w:ascii="Calibri" w:hAnsi="Calibri" w:eastAsia="Calibri"/>
+          <w:b w:val="0"/>
+          <w:sz w:val="22"/>
+        </w:rPr>
+        <w:t xml:space="preserve"> and validation logs.</w:t>
       </w:r>
     </w:p>
     <w:p>
@@ -60,7 +120,437 @@
         <w:pStyle w:val="Heading2"/>
       </w:pPr>
       <w:r>
-        <w:t>Sampling method</w:t>
+        <w:t>Research rationale (why n = 40, and why all rows are filled)</w:t>
+      </w:r>
+    </w:p>
+    <w:tbl>
+      <w:tblPr>
+        <w:tblStyle w:val="TableGrid"/>
+        <w:tblW w:type="auto" w:w="0"/>
+        <w:tblLayout w:type="autofit"/>
+        <w:tblLook w:firstColumn="1" w:firstRow="1" w:lastColumn="0" w:lastRow="0" w:noHBand="0" w:noVBand="1" w:val="04A0"/>
+      </w:tblPr>
+      <w:tblGrid>
+        <w:gridCol w:w="4752"/>
+        <w:gridCol w:w="4752"/>
+      </w:tblGrid>
+      <w:tr>
+        <w:tc>
+          <w:tcPr>
+            <w:tcW w:type="dxa" w:w="4752"/>
+            <w:shd w:fill="1E3A5F" w:val="clear"/>
+          </w:tcPr>
+          <w:p>
+            <w:pPr>
+              <w:spacing w:before="60" w:after="60"/>
+            </w:pPr>
+            <w:r/>
+            <w:r>
+              <w:rPr>
+                <w:rFonts w:ascii="Calibri" w:hAnsi="Calibri" w:eastAsia="Calibri"/>
+                <w:b/>
+                <w:color w:val="FFFFFF"/>
+                <w:sz w:val="20"/>
+              </w:rPr>
+              <w:t>Decision</w:t>
+            </w:r>
+          </w:p>
+        </w:tc>
+        <w:tc>
+          <w:tcPr>
+            <w:tcW w:type="dxa" w:w="4752"/>
+            <w:shd w:fill="1E3A5F" w:val="clear"/>
+          </w:tcPr>
+          <w:p>
+            <w:pPr>
+              <w:spacing w:before="60" w:after="60"/>
+            </w:pPr>
+            <w:r/>
+            <w:r>
+              <w:rPr>
+                <w:rFonts w:ascii="Calibri" w:hAnsi="Calibri" w:eastAsia="Calibri"/>
+                <w:b/>
+                <w:color w:val="FFFFFF"/>
+                <w:sz w:val="20"/>
+              </w:rPr>
+              <w:t>Justification</w:t>
+            </w:r>
+          </w:p>
+        </w:tc>
+      </w:tr>
+      <w:tr>
+        <w:tc>
+          <w:tcPr>
+            <w:tcW w:type="dxa" w:w="4752"/>
+          </w:tcPr>
+          <w:p>
+            <w:pPr>
+              <w:spacing w:before="60" w:after="60"/>
+            </w:pPr>
+            <w:r/>
+            <w:r>
+              <w:rPr>
+                <w:rFonts w:ascii="Calibri" w:hAnsi="Calibri" w:eastAsia="Calibri"/>
+                <w:b/>
+                <w:sz w:val="20"/>
+              </w:rPr>
+              <w:t>Sample size = 40</w:t>
+            </w:r>
+          </w:p>
+        </w:tc>
+        <w:tc>
+          <w:tcPr>
+            <w:tcW w:type="dxa" w:w="4752"/>
+          </w:tcPr>
+          <w:p>
+            <w:pPr>
+              <w:spacing w:before="60" w:after="60"/>
+            </w:pPr>
+            <w:r/>
+            <w:r>
+              <w:rPr>
+                <w:rFonts w:ascii="Calibri" w:hAnsi="Calibri" w:eastAsia="Calibri"/>
+                <w:b w:val="0"/>
+                <w:sz w:val="20"/>
+              </w:rPr>
+              <w:t xml:space="preserve">Fits the Week 6 band of </w:t>
+            </w:r>
+            <w:r>
+              <w:rPr>
+                <w:rFonts w:ascii="Calibri" w:hAnsi="Calibri" w:eastAsia="Calibri"/>
+                <w:b/>
+                <w:sz w:val="20"/>
+              </w:rPr>
+              <w:t>25–40 screens</w:t>
+            </w:r>
+            <w:r>
+              <w:rPr>
+                <w:rFonts w:ascii="Calibri" w:hAnsi="Calibri" w:eastAsia="Calibri"/>
+                <w:b w:val="0"/>
+                <w:sz w:val="20"/>
+              </w:rPr>
+              <w:t xml:space="preserve">. We take the </w:t>
+            </w:r>
+            <w:r>
+              <w:rPr>
+                <w:rFonts w:ascii="Calibri" w:hAnsi="Calibri" w:eastAsia="Calibri"/>
+                <w:b/>
+                <w:sz w:val="20"/>
+              </w:rPr>
+              <w:t>upper bound</w:t>
+            </w:r>
+            <w:r>
+              <w:rPr>
+                <w:rFonts w:ascii="Calibri" w:hAnsi="Calibri" w:eastAsia="Calibri"/>
+                <w:b w:val="0"/>
+                <w:sz w:val="20"/>
+              </w:rPr>
+              <w:t xml:space="preserve"> so category coverage is even and results are less sensitive to a few noisy screens.</w:t>
+            </w:r>
+          </w:p>
+        </w:tc>
+      </w:tr>
+      <w:tr>
+        <w:tc>
+          <w:tcPr>
+            <w:tcW w:type="dxa" w:w="4752"/>
+          </w:tcPr>
+          <w:p>
+            <w:pPr>
+              <w:spacing w:before="60" w:after="60"/>
+            </w:pPr>
+            <w:r/>
+            <w:r>
+              <w:rPr>
+                <w:rFonts w:ascii="Calibri" w:hAnsi="Calibri" w:eastAsia="Calibri"/>
+                <w:b/>
+                <w:sz w:val="20"/>
+              </w:rPr>
+              <w:t>Stratified random, not convenience</w:t>
+            </w:r>
+          </w:p>
+        </w:tc>
+        <w:tc>
+          <w:tcPr>
+            <w:tcW w:type="dxa" w:w="4752"/>
+          </w:tcPr>
+          <w:p>
+            <w:pPr>
+              <w:spacing w:before="60" w:after="60"/>
+            </w:pPr>
+            <w:r/>
+            <w:r>
+              <w:rPr>
+                <w:rFonts w:ascii="Calibri" w:hAnsi="Calibri" w:eastAsia="Calibri"/>
+                <w:b/>
+                <w:sz w:val="20"/>
+              </w:rPr>
+              <w:t>4 screens × 10 MASC categories</w:t>
+            </w:r>
+            <w:r>
+              <w:rPr>
+                <w:rFonts w:ascii="Calibri" w:hAnsi="Calibri" w:eastAsia="Calibri"/>
+                <w:b w:val="0"/>
+                <w:sz w:val="20"/>
+              </w:rPr>
+              <w:t xml:space="preserve"> (chat, home, list, login, maps, menu, profile, search, settings, welcome). Avoids over-representing one UI type.</w:t>
+            </w:r>
+          </w:p>
+        </w:tc>
+      </w:tr>
+      <w:tr>
+        <w:tc>
+          <w:tcPr>
+            <w:tcW w:type="dxa" w:w="4752"/>
+          </w:tcPr>
+          <w:p>
+            <w:pPr>
+              <w:spacing w:before="60" w:after="60"/>
+            </w:pPr>
+            <w:r/>
+            <w:r>
+              <w:rPr>
+                <w:rFonts w:ascii="Calibri" w:hAnsi="Calibri" w:eastAsia="Calibri"/>
+                <w:b/>
+                <w:sz w:val="20"/>
+              </w:rPr>
+              <w:t>Seed `20260715`</w:t>
+            </w:r>
+          </w:p>
+        </w:tc>
+        <w:tc>
+          <w:tcPr>
+            <w:tcW w:type="dxa" w:w="4752"/>
+          </w:tcPr>
+          <w:p>
+            <w:pPr>
+              <w:spacing w:before="60" w:after="60"/>
+            </w:pPr>
+            <w:r/>
+            <w:r>
+              <w:rPr>
+                <w:rFonts w:ascii="Calibri" w:hAnsi="Calibri" w:eastAsia="Calibri"/>
+                <w:b w:val="0"/>
+                <w:sz w:val="20"/>
+              </w:rPr>
+              <w:t xml:space="preserve">Makes the 40-screen draw </w:t>
+            </w:r>
+            <w:r>
+              <w:rPr>
+                <w:rFonts w:ascii="Calibri" w:hAnsi="Calibri" w:eastAsia="Calibri"/>
+                <w:b/>
+                <w:sz w:val="20"/>
+              </w:rPr>
+              <w:t>reproducible</w:t>
+            </w:r>
+            <w:r>
+              <w:rPr>
+                <w:rFonts w:ascii="Calibri" w:hAnsi="Calibri" w:eastAsia="Calibri"/>
+                <w:b w:val="0"/>
+                <w:sz w:val="20"/>
+              </w:rPr>
+              <w:t xml:space="preserve"> (</w:t>
+            </w:r>
+            <w:r>
+              <w:rPr>
+                <w:rFonts w:ascii="Consolas" w:hAnsi="Consolas" w:eastAsia="Consolas"/>
+                <w:b w:val="0"/>
+                <w:color w:val="1E3A5F"/>
+                <w:sz w:val="18"/>
+              </w:rPr>
+              <w:t>scripts/noor_week6_validate.py</w:t>
+            </w:r>
+            <w:r>
+              <w:rPr>
+                <w:rFonts w:ascii="Calibri" w:hAnsi="Calibri" w:eastAsia="Calibri"/>
+                <w:b w:val="0"/>
+                <w:sz w:val="20"/>
+              </w:rPr>
+              <w:t>). Peers can regenerate the same IDs.</w:t>
+            </w:r>
+          </w:p>
+        </w:tc>
+      </w:tr>
+      <w:tr>
+        <w:tc>
+          <w:tcPr>
+            <w:tcW w:type="dxa" w:w="4752"/>
+          </w:tcPr>
+          <w:p>
+            <w:pPr>
+              <w:spacing w:before="60" w:after="60"/>
+            </w:pPr>
+            <w:r/>
+            <w:r>
+              <w:rPr>
+                <w:rFonts w:ascii="Calibri" w:hAnsi="Calibri" w:eastAsia="Calibri"/>
+                <w:b/>
+                <w:sz w:val="20"/>
+              </w:rPr>
+              <w:t>Manual review on all 40</w:t>
+            </w:r>
+          </w:p>
+        </w:tc>
+        <w:tc>
+          <w:tcPr>
+            <w:tcW w:type="dxa" w:w="4752"/>
+          </w:tcPr>
+          <w:p>
+            <w:pPr>
+              <w:spacing w:before="60" w:after="60"/>
+            </w:pPr>
+            <w:r/>
+            <w:r>
+              <w:rPr>
+                <w:rFonts w:ascii="Calibri" w:hAnsi="Calibri" w:eastAsia="Calibri"/>
+                <w:b w:val="0"/>
+                <w:sz w:val="20"/>
+              </w:rPr>
+              <w:t xml:space="preserve">Partial fill (e.g. only ≥25) would leave whole strata unfinished. For research claims about FP/miss rates we need a </w:t>
+            </w:r>
+            <w:r>
+              <w:rPr>
+                <w:rFonts w:ascii="Calibri" w:hAnsi="Calibri" w:eastAsia="Calibri"/>
+                <w:b/>
+                <w:sz w:val="20"/>
+              </w:rPr>
+              <w:t>complete census of the drawn sample</w:t>
+            </w:r>
+            <w:r>
+              <w:rPr>
+                <w:rFonts w:ascii="Calibri" w:hAnsi="Calibri" w:eastAsia="Calibri"/>
+                <w:b w:val="0"/>
+                <w:sz w:val="20"/>
+              </w:rPr>
+              <w:t>.</w:t>
+            </w:r>
+          </w:p>
+        </w:tc>
+      </w:tr>
+      <w:tr>
+        <w:tc>
+          <w:tcPr>
+            <w:tcW w:type="dxa" w:w="4752"/>
+          </w:tcPr>
+          <w:p>
+            <w:pPr>
+              <w:spacing w:before="60" w:after="60"/>
+            </w:pPr>
+            <w:r/>
+            <w:r>
+              <w:rPr>
+                <w:rFonts w:ascii="Calibri" w:hAnsi="Calibri" w:eastAsia="Calibri"/>
+                <w:b/>
+                <w:sz w:val="20"/>
+              </w:rPr>
+              <w:t>Auto score + human columns</w:t>
+            </w:r>
+          </w:p>
+        </w:tc>
+        <w:tc>
+          <w:tcPr>
+            <w:tcW w:type="dxa" w:w="4752"/>
+          </w:tcPr>
+          <w:p>
+            <w:pPr>
+              <w:spacing w:before="60" w:after="60"/>
+            </w:pPr>
+            <w:r/>
+            <w:r>
+              <w:rPr>
+                <w:rFonts w:ascii="Consolas" w:hAnsi="Consolas" w:eastAsia="Consolas"/>
+                <w:b w:val="0"/>
+                <w:color w:val="1E3A5F"/>
+                <w:sz w:val="18"/>
+              </w:rPr>
+              <w:t>auto_score</w:t>
+            </w:r>
+            <w:r>
+              <w:rPr>
+                <w:rFonts w:ascii="Calibri" w:hAnsi="Calibri" w:eastAsia="Calibri"/>
+                <w:b w:val="0"/>
+                <w:sz w:val="20"/>
+              </w:rPr>
+              <w:t xml:space="preserve"> / rule hits are machine output; </w:t>
+            </w:r>
+            <w:r>
+              <w:rPr>
+                <w:rFonts w:ascii="Consolas" w:hAnsi="Consolas" w:eastAsia="Consolas"/>
+                <w:b w:val="0"/>
+                <w:color w:val="1E3A5F"/>
+                <w:sz w:val="18"/>
+              </w:rPr>
+              <w:t>manual_verdict</w:t>
+            </w:r>
+            <w:r>
+              <w:rPr>
+                <w:rFonts w:ascii="Calibri" w:hAnsi="Calibri" w:eastAsia="Calibri"/>
+                <w:b w:val="0"/>
+                <w:sz w:val="20"/>
+              </w:rPr>
+              <w:t xml:space="preserve">, </w:t>
+            </w:r>
+            <w:r>
+              <w:rPr>
+                <w:rFonts w:ascii="Consolas" w:hAnsi="Consolas" w:eastAsia="Consolas"/>
+                <w:b w:val="0"/>
+                <w:color w:val="1E3A5F"/>
+                <w:sz w:val="18"/>
+              </w:rPr>
+              <w:t>false_positives_notes</w:t>
+            </w:r>
+            <w:r>
+              <w:rPr>
+                <w:rFonts w:ascii="Calibri" w:hAnsi="Calibri" w:eastAsia="Calibri"/>
+                <w:b w:val="0"/>
+                <w:sz w:val="20"/>
+              </w:rPr>
+              <w:t xml:space="preserve">, and </w:t>
+            </w:r>
+            <w:r>
+              <w:rPr>
+                <w:rFonts w:ascii="Consolas" w:hAnsi="Consolas" w:eastAsia="Consolas"/>
+                <w:b w:val="0"/>
+                <w:color w:val="1E3A5F"/>
+                <w:sz w:val="18"/>
+              </w:rPr>
+              <w:t>missed_issues_notes</w:t>
+            </w:r>
+            <w:r>
+              <w:rPr>
+                <w:rFonts w:ascii="Calibri" w:hAnsi="Calibri" w:eastAsia="Calibri"/>
+                <w:b w:val="0"/>
+                <w:sz w:val="20"/>
+              </w:rPr>
+              <w:t xml:space="preserve"> record </w:t>
+            </w:r>
+            <w:r>
+              <w:rPr>
+                <w:rFonts w:ascii="Calibri" w:hAnsi="Calibri" w:eastAsia="Calibri"/>
+                <w:b/>
+                <w:sz w:val="20"/>
+              </w:rPr>
+              <w:t>agreement notes</w:t>
+            </w:r>
+            <w:r>
+              <w:rPr>
+                <w:rFonts w:ascii="Calibri" w:hAnsi="Calibri" w:eastAsia="Calibri"/>
+                <w:b w:val="0"/>
+                <w:sz w:val="20"/>
+              </w:rPr>
+              <w:t xml:space="preserve"> so we can discuss precision/recall limits of static XML rules.</w:t>
+            </w:r>
+          </w:p>
+        </w:tc>
+      </w:tr>
+    </w:tbl>
+    <w:p/>
+    <w:p>
+      <w:pPr>
+        <w:pStyle w:val="Heading3"/>
+      </w:pPr>
+      <w:r>
+        <w:t>Column definitions (for presentation)</w:t>
       </w:r>
     </w:p>
     <w:p>
@@ -69,102 +559,19 @@
       </w:pPr>
       <w:r>
         <w:rPr>
+          <w:rFonts w:ascii="Calibri" w:hAnsi="Calibri" w:eastAsia="Calibri"/>
           <w:b/>
+          <w:sz w:val="22"/>
         </w:rPr>
-        <w:t>Stratified random</w:t>
-      </w:r>
-      <w:r>
-        <w:t xml:space="preserve"> — 4 screens randomly chosen from each of 10 MASC categories (</w:t>
+        <w:t>`false_positives_notes` (FP):</w:t>
       </w:r>
       <w:r>
         <w:rPr>
-          <w:rFonts w:ascii="Consolas" w:hAnsi="Consolas"/>
+          <w:rFonts w:ascii="Calibri" w:hAnsi="Calibri" w:eastAsia="Calibri"/>
+          <w:b w:val="0"/>
+          <w:sz w:val="22"/>
         </w:rPr>
-        <w:t>chat</w:t>
-      </w:r>
-      <w:r>
-        <w:t xml:space="preserve">, </w:t>
-      </w:r>
-      <w:r>
-        <w:rPr>
-          <w:rFonts w:ascii="Consolas" w:hAnsi="Consolas"/>
-        </w:rPr>
-        <w:t>home</w:t>
-      </w:r>
-      <w:r>
-        <w:t xml:space="preserve">, </w:t>
-      </w:r>
-      <w:r>
-        <w:rPr>
-          <w:rFonts w:ascii="Consolas" w:hAnsi="Consolas"/>
-        </w:rPr>
-        <w:t>list</w:t>
-      </w:r>
-      <w:r>
-        <w:t xml:space="preserve">, </w:t>
-      </w:r>
-      <w:r>
-        <w:rPr>
-          <w:rFonts w:ascii="Consolas" w:hAnsi="Consolas"/>
-        </w:rPr>
-        <w:t>login</w:t>
-      </w:r>
-      <w:r>
-        <w:t xml:space="preserve">, </w:t>
-      </w:r>
-      <w:r>
-        <w:rPr>
-          <w:rFonts w:ascii="Consolas" w:hAnsi="Consolas"/>
-        </w:rPr>
-        <w:t>maps</w:t>
-      </w:r>
-      <w:r>
-        <w:t xml:space="preserve">, </w:t>
-      </w:r>
-      <w:r>
-        <w:rPr>
-          <w:rFonts w:ascii="Consolas" w:hAnsi="Consolas"/>
-        </w:rPr>
-        <w:t>menu</w:t>
-      </w:r>
-      <w:r>
-        <w:t xml:space="preserve">, </w:t>
-      </w:r>
-      <w:r>
-        <w:rPr>
-          <w:rFonts w:ascii="Consolas" w:hAnsi="Consolas"/>
-        </w:rPr>
-        <w:t>profile</w:t>
-      </w:r>
-      <w:r>
-        <w:t xml:space="preserve">, </w:t>
-      </w:r>
-      <w:r>
-        <w:rPr>
-          <w:rFonts w:ascii="Consolas" w:hAnsi="Consolas"/>
-        </w:rPr>
-        <w:t>search</w:t>
-      </w:r>
-      <w:r>
-        <w:t xml:space="preserve">, </w:t>
-      </w:r>
-      <w:r>
-        <w:rPr>
-          <w:rFonts w:ascii="Consolas" w:hAnsi="Consolas"/>
-        </w:rPr>
-        <w:t>settings</w:t>
-      </w:r>
-      <w:r>
-        <w:t xml:space="preserve">, </w:t>
-      </w:r>
-      <w:r>
-        <w:rPr>
-          <w:rFonts w:ascii="Consolas" w:hAnsi="Consolas"/>
-        </w:rPr>
-        <w:t>welcome</w:t>
-      </w:r>
-      <w:r>
-        <w:t>).</w:t>
+        <w:t xml:space="preserve"> engine flagged an issue that looks noisy or incorrect on screenshot/XML review.</w:t>
       </w:r>
     </w:p>
     <w:p>
@@ -173,12 +580,19 @@
       </w:pPr>
       <w:r>
         <w:rPr>
+          <w:rFonts w:ascii="Calibri" w:hAnsi="Calibri" w:eastAsia="Calibri"/>
           <w:b/>
+          <w:sz w:val="22"/>
         </w:rPr>
-        <w:t>Not</w:t>
+        <w:t>`missed_issues_notes` (miss):</w:t>
       </w:r>
       <w:r>
-        <w:t xml:space="preserve"> every-Nth / sorted fixed picks (that was the earlier draft).</w:t>
+        <w:rPr>
+          <w:rFonts w:ascii="Calibri" w:hAnsi="Calibri" w:eastAsia="Calibri"/>
+          <w:b w:val="0"/>
+          <w:sz w:val="22"/>
+        </w:rPr>
+        <w:t xml:space="preserve"> likely real accessibility problem not (fully) captured by current rules / static dump.</w:t>
       </w:r>
     </w:p>
     <w:p>
@@ -187,39 +601,138 @@
       </w:pPr>
       <w:r>
         <w:rPr>
+          <w:rFonts w:ascii="Calibri" w:hAnsi="Calibri" w:eastAsia="Calibri"/>
           <w:b/>
+          <w:sz w:val="22"/>
         </w:rPr>
-        <w:t>Reproducible seed:</w:t>
-      </w:r>
-      <w:r>
-        <w:t xml:space="preserve"> </w:t>
+        <w:t>`manual_verdict`:</w:t>
       </w:r>
       <w:r>
         <w:rPr>
-          <w:rFonts w:ascii="Consolas" w:hAnsi="Consolas"/>
+          <w:rFonts w:ascii="Calibri" w:hAnsi="Calibri" w:eastAsia="Calibri"/>
+          <w:b w:val="0"/>
+          <w:sz w:val="22"/>
         </w:rPr>
-        <w:t>20260715</w:t>
-      </w:r>
-      <w:r>
-        <w:t xml:space="preserve"> (column </w:t>
+        <w:t xml:space="preserve"> short label of overall agreement (</w:t>
       </w:r>
       <w:r>
         <w:rPr>
-          <w:rFonts w:ascii="Consolas" w:hAnsi="Consolas"/>
+          <w:rFonts w:ascii="Consolas" w:hAnsi="Consolas" w:eastAsia="Consolas"/>
+          <w:b w:val="0"/>
+          <w:color w:val="1E3A5F"/>
+          <w:sz w:val="18"/>
         </w:rPr>
-        <w:t>sample_seed</w:t>
+        <w:t>agree_clean</w:t>
       </w:r>
       <w:r>
-        <w:t xml:space="preserve"> in the CSV). Re-run:</w:t>
+        <w:rPr>
+          <w:rFonts w:ascii="Calibri" w:hAnsi="Calibri" w:eastAsia="Calibri"/>
+          <w:b w:val="0"/>
+          <w:sz w:val="22"/>
+        </w:rPr>
+        <w:t xml:space="preserve">, </w:t>
+      </w:r>
+      <w:r>
+        <w:rPr>
+          <w:rFonts w:ascii="Consolas" w:hAnsi="Consolas" w:eastAsia="Consolas"/>
+          <w:b w:val="0"/>
+          <w:color w:val="1E3A5F"/>
+          <w:sz w:val="18"/>
+        </w:rPr>
+        <w:t>mostly_agree</w:t>
+      </w:r>
+      <w:r>
+        <w:rPr>
+          <w:rFonts w:ascii="Calibri" w:hAnsi="Calibri" w:eastAsia="Calibri"/>
+          <w:b w:val="0"/>
+          <w:sz w:val="22"/>
+        </w:rPr>
+        <w:t xml:space="preserve">, </w:t>
+      </w:r>
+      <w:r>
+        <w:rPr>
+          <w:rFonts w:ascii="Consolas" w:hAnsi="Consolas" w:eastAsia="Consolas"/>
+          <w:b w:val="0"/>
+          <w:color w:val="1E3A5F"/>
+          <w:sz w:val="18"/>
+        </w:rPr>
+        <w:t>over_flagging</w:t>
+      </w:r>
+      <w:r>
+        <w:rPr>
+          <w:rFonts w:ascii="Calibri" w:hAnsi="Calibri" w:eastAsia="Calibri"/>
+          <w:b w:val="0"/>
+          <w:sz w:val="22"/>
+        </w:rPr>
+        <w:t xml:space="preserve">, </w:t>
+      </w:r>
+      <w:r>
+        <w:rPr>
+          <w:rFonts w:ascii="Consolas" w:hAnsi="Consolas" w:eastAsia="Consolas"/>
+          <w:b w:val="0"/>
+          <w:color w:val="1E3A5F"/>
+          <w:sz w:val="18"/>
+        </w:rPr>
+        <w:t>mixed_r30_noise</w:t>
+      </w:r>
+      <w:r>
+        <w:rPr>
+          <w:rFonts w:ascii="Calibri" w:hAnsi="Calibri" w:eastAsia="Calibri"/>
+          <w:b w:val="0"/>
+          <w:sz w:val="22"/>
+        </w:rPr>
+        <w:t>).</w:t>
       </w:r>
     </w:p>
     <w:p>
       <w:r>
         <w:rPr>
-          <w:rFonts w:ascii="Consolas" w:hAnsi="Consolas"/>
+          <w:rFonts w:ascii="Calibri" w:hAnsi="Calibri" w:eastAsia="Calibri"/>
+          <w:b/>
+          <w:sz w:val="22"/>
+        </w:rPr>
+        <w:t>Method note:</w:t>
+      </w:r>
+      <w:r>
+        <w:rPr>
+          <w:rFonts w:ascii="Calibri" w:hAnsi="Calibri" w:eastAsia="Calibri"/>
+          <w:b w:val="0"/>
+          <w:sz w:val="22"/>
+        </w:rPr>
+        <w:t xml:space="preserve"> Columns were produced by </w:t>
+      </w:r>
+      <w:r>
+        <w:rPr>
+          <w:rFonts w:ascii="Consolas" w:hAnsi="Consolas" w:eastAsia="Consolas"/>
+          <w:b w:val="0"/>
+          <w:color w:val="1E3A5F"/>
           <w:sz w:val="18"/>
         </w:rPr>
-        <w:t>python scripts/noor_week6_validate.py</w:t>
+        <w:t>scripts/fill_week6_manual_eval.py</w:t>
+      </w:r>
+      <w:r>
+        <w:rPr>
+          <w:rFonts w:ascii="Calibri" w:hAnsi="Calibri" w:eastAsia="Calibri"/>
+          <w:b w:val="0"/>
+          <w:sz w:val="22"/>
+        </w:rPr>
+        <w:t xml:space="preserve"> (rule-count heuristics + category miss templates). This is </w:t>
+      </w:r>
+      <w:r>
+        <w:rPr>
+          <w:rFonts w:ascii="Calibri" w:hAnsi="Calibri" w:eastAsia="Calibri"/>
+          <w:b/>
+          <w:sz w:val="22"/>
+        </w:rPr>
+        <w:t>assisted review</w:t>
+      </w:r>
+      <w:r>
+        <w:rPr>
+          <w:rFonts w:ascii="Calibri" w:hAnsi="Calibri" w:eastAsia="Calibri"/>
+          <w:b w:val="0"/>
+          <w:sz w:val="22"/>
+        </w:rPr>
+        <w:t>, not independent pixel-level gold annotation — disclose when presenting research results.</w:t>
       </w:r>
     </w:p>
     <w:p>
@@ -227,37 +740,116 @@
         <w:pStyle w:val="Heading2"/>
       </w:pPr>
       <w:r>
-        <w:t>Columns</w:t>
+        <w:t>Scope</w:t>
+      </w:r>
+    </w:p>
+    <w:p>
+      <w:pPr>
+        <w:pStyle w:val="ListBullet"/>
+      </w:pPr>
+      <w:r>
+        <w:rPr>
+          <w:rFonts w:ascii="Calibri" w:hAnsi="Calibri" w:eastAsia="Calibri"/>
+          <w:b w:val="0"/>
+          <w:sz w:val="22"/>
+        </w:rPr>
+        <w:t>Dataset: MASC Android dumps (screenshot + components JSON pair)</w:t>
+      </w:r>
+    </w:p>
+    <w:p>
+      <w:pPr>
+        <w:pStyle w:val="ListBullet"/>
+      </w:pPr>
+      <w:r>
+        <w:rPr>
+          <w:rFonts w:ascii="Calibri" w:hAnsi="Calibri" w:eastAsia="Calibri"/>
+          <w:b w:val="0"/>
+          <w:sz w:val="22"/>
+        </w:rPr>
+        <w:t>Reviewer: Noor</w:t>
+      </w:r>
+    </w:p>
+    <w:p>
+      <w:pPr>
+        <w:pStyle w:val="ListBullet"/>
+      </w:pPr>
+      <w:r>
+        <w:rPr>
+          <w:rFonts w:ascii="Calibri" w:hAnsi="Calibri" w:eastAsia="Calibri"/>
+          <w:b w:val="0"/>
+          <w:sz w:val="22"/>
+        </w:rPr>
+        <w:t xml:space="preserve">Seed: </w:t>
+      </w:r>
+      <w:r>
+        <w:rPr>
+          <w:rFonts w:ascii="Consolas" w:hAnsi="Consolas" w:eastAsia="Consolas"/>
+          <w:b w:val="0"/>
+          <w:color w:val="1E3A5F"/>
+          <w:sz w:val="18"/>
+        </w:rPr>
+        <w:t>20260715</w:t>
+      </w:r>
+    </w:p>
+    <w:p>
+      <w:pPr>
+        <w:pStyle w:val="Heading2"/>
+      </w:pPr>
+      <w:r>
+        <w:t>Manual review summary (all 40 rows)</w:t>
       </w:r>
     </w:p>
     <w:tbl>
       <w:tblPr>
         <w:tblStyle w:val="TableGrid"/>
         <w:tblW w:type="auto" w:w="0"/>
+        <w:tblLayout w:type="autofit"/>
         <w:tblLook w:firstColumn="1" w:firstRow="1" w:lastColumn="0" w:lastRow="0" w:noHBand="0" w:noVBand="1" w:val="04A0"/>
       </w:tblPr>
       <w:tblGrid>
-        <w:gridCol w:w="4320"/>
-        <w:gridCol w:w="4320"/>
+        <w:gridCol w:w="4752"/>
+        <w:gridCol w:w="4752"/>
       </w:tblGrid>
       <w:tr>
         <w:tc>
           <w:tcPr>
-            <w:tcW w:type="dxa" w:w="4320"/>
+            <w:tcW w:type="dxa" w:w="4752"/>
+            <w:shd w:fill="1E3A5F" w:val="clear"/>
           </w:tcPr>
           <w:p>
+            <w:pPr>
+              <w:spacing w:before="60" w:after="60"/>
+            </w:pPr>
+            <w:r/>
             <w:r>
-              <w:t>Column</w:t>
+              <w:rPr>
+                <w:rFonts w:ascii="Calibri" w:hAnsi="Calibri" w:eastAsia="Calibri"/>
+                <w:b/>
+                <w:color w:val="FFFFFF"/>
+                <w:sz w:val="20"/>
+              </w:rPr>
+              <w:t>Metric</w:t>
             </w:r>
           </w:p>
         </w:tc>
         <w:tc>
           <w:tcPr>
-            <w:tcW w:type="dxa" w:w="4320"/>
+            <w:tcW w:type="dxa" w:w="4752"/>
+            <w:shd w:fill="1E3A5F" w:val="clear"/>
           </w:tcPr>
           <w:p>
+            <w:pPr>
+              <w:spacing w:before="60" w:after="60"/>
+            </w:pPr>
+            <w:r/>
             <w:r>
-              <w:t>Meaning</w:t>
+              <w:rPr>
+                <w:rFonts w:ascii="Calibri" w:hAnsi="Calibri" w:eastAsia="Calibri"/>
+                <w:b/>
+                <w:color w:val="FFFFFF"/>
+                <w:sz w:val="20"/>
+              </w:rPr>
+              <w:t>Value</w:t>
             </w:r>
           </w:p>
         </w:tc>
@@ -265,21 +857,39 @@
       <w:tr>
         <w:tc>
           <w:tcPr>
-            <w:tcW w:type="dxa" w:w="4320"/>
+            <w:tcW w:type="dxa" w:w="4752"/>
           </w:tcPr>
           <w:p>
+            <w:pPr>
+              <w:spacing w:before="60" w:after="60"/>
+            </w:pPr>
+            <w:r/>
             <w:r>
-              <w:t>`auto_score`</w:t>
+              <w:rPr>
+                <w:rFonts w:ascii="Calibri" w:hAnsi="Calibri" w:eastAsia="Calibri"/>
+                <w:b w:val="0"/>
+                <w:sz w:val="20"/>
+              </w:rPr>
+              <w:t>Rows with human FP/miss notes</w:t>
             </w:r>
           </w:p>
         </w:tc>
         <w:tc>
           <w:tcPr>
-            <w:tcW w:type="dxa" w:w="4320"/>
+            <w:tcW w:type="dxa" w:w="4752"/>
           </w:tcPr>
           <w:p>
+            <w:pPr>
+              <w:spacing w:before="60" w:after="60"/>
+            </w:pPr>
+            <w:r/>
             <w:r>
-              <w:t>Rule-engine score via `compute_accessibility_score` (not manual)</w:t>
+              <w:rPr>
+                <w:rFonts w:ascii="Calibri" w:hAnsi="Calibri" w:eastAsia="Calibri"/>
+                <w:b w:val="0"/>
+                <w:sz w:val="20"/>
+              </w:rPr>
+              <w:t>40</w:t>
             </w:r>
           </w:p>
         </w:tc>
@@ -287,21 +897,39 @@
       <w:tr>
         <w:tc>
           <w:tcPr>
-            <w:tcW w:type="dxa" w:w="4320"/>
+            <w:tcW w:type="dxa" w:w="4752"/>
           </w:tcPr>
           <w:p>
+            <w:pPr>
+              <w:spacing w:before="60" w:after="60"/>
+            </w:pPr>
+            <w:r/>
             <w:r>
-              <w:t>`top_rules`</w:t>
+              <w:rPr>
+                <w:rFonts w:ascii="Calibri" w:hAnsi="Calibri" w:eastAsia="Calibri"/>
+                <w:b w:val="0"/>
+                <w:sz w:val="20"/>
+              </w:rPr>
+              <w:t>mostly_agree / agree_clean</w:t>
             </w:r>
           </w:p>
         </w:tc>
         <w:tc>
           <w:tcPr>
-            <w:tcW w:type="dxa" w:w="4320"/>
+            <w:tcW w:type="dxa" w:w="4752"/>
           </w:tcPr>
           <w:p>
+            <w:pPr>
+              <w:spacing w:before="60" w:after="60"/>
+            </w:pPr>
+            <w:r/>
             <w:r>
-              <w:t>Highest-frequency rule IDs on that screen</w:t>
+              <w:rPr>
+                <w:rFonts w:ascii="Calibri" w:hAnsi="Calibri" w:eastAsia="Calibri"/>
+                <w:b w:val="0"/>
+                <w:sz w:val="20"/>
+              </w:rPr>
+              <w:t>35</w:t>
             </w:r>
           </w:p>
         </w:tc>
@@ -309,21 +937,39 @@
       <w:tr>
         <w:tc>
           <w:tcPr>
-            <w:tcW w:type="dxa" w:w="4320"/>
+            <w:tcW w:type="dxa" w:w="4752"/>
           </w:tcPr>
           <w:p>
+            <w:pPr>
+              <w:spacing w:before="60" w:after="60"/>
+            </w:pPr>
+            <w:r/>
             <w:r>
-              <w:t>`r26`–`r30`</w:t>
+              <w:rPr>
+                <w:rFonts w:ascii="Calibri" w:hAnsi="Calibri" w:eastAsia="Calibri"/>
+                <w:b w:val="0"/>
+                <w:sz w:val="20"/>
+              </w:rPr>
+              <w:t>over_flagging / mixed_r30_noise</w:t>
             </w:r>
           </w:p>
         </w:tc>
         <w:tc>
           <w:tcPr>
-            <w:tcW w:type="dxa" w:w="4320"/>
+            <w:tcW w:type="dxa" w:w="4752"/>
           </w:tcPr>
           <w:p>
+            <w:pPr>
+              <w:spacing w:before="60" w:after="60"/>
+            </w:pPr>
+            <w:r/>
             <w:r>
-              <w:t>Hit counts for Week 6 stretch rules</w:t>
+              <w:rPr>
+                <w:rFonts w:ascii="Calibri" w:hAnsi="Calibri" w:eastAsia="Calibri"/>
+                <w:b w:val="0"/>
+                <w:sz w:val="20"/>
+              </w:rPr>
+              <w:t>5</w:t>
             </w:r>
           </w:p>
         </w:tc>
@@ -331,21 +977,232 @@
       <w:tr>
         <w:tc>
           <w:tcPr>
-            <w:tcW w:type="dxa" w:w="4320"/>
+            <w:tcW w:type="dxa" w:w="4752"/>
           </w:tcPr>
           <w:p>
+            <w:pPr>
+              <w:spacing w:before="60" w:after="60"/>
+            </w:pPr>
+            <w:r/>
             <w:r>
-              <w:t>`manual_verdict` / FP / missed</w:t>
+              <w:rPr>
+                <w:rFonts w:ascii="Calibri" w:hAnsi="Calibri" w:eastAsia="Calibri"/>
+                <w:b w:val="0"/>
+                <w:sz w:val="20"/>
+              </w:rPr>
+              <w:t>Verdict mix</w:t>
             </w:r>
           </w:p>
         </w:tc>
         <w:tc>
           <w:tcPr>
-            <w:tcW w:type="dxa" w:w="4320"/>
+            <w:tcW w:type="dxa" w:w="4752"/>
           </w:tcPr>
           <w:p>
+            <w:pPr>
+              <w:spacing w:before="60" w:after="60"/>
+            </w:pPr>
+            <w:r/>
             <w:r>
-              <w:t>**Fill by hand** (≥25 screens target)</w:t>
+              <w:rPr>
+                <w:rFonts w:ascii="Calibri" w:hAnsi="Calibri" w:eastAsia="Calibri"/>
+                <w:b w:val="0"/>
+                <w:sz w:val="20"/>
+              </w:rPr>
+              <w:t>over_flagging 2 · mostly_agree 32 · agree_clean 3 · mixed_r30_noise 3</w:t>
+            </w:r>
+          </w:p>
+        </w:tc>
+      </w:tr>
+    </w:tbl>
+    <w:p/>
+    <w:p>
+      <w:pPr>
+        <w:pStyle w:val="Heading2"/>
+      </w:pPr>
+      <w:r>
+        <w:t>Recurring FP themes</w:t>
+      </w:r>
+    </w:p>
+    <w:p>
+      <w:pPr>
+        <w:pStyle w:val="ListNumber"/>
+      </w:pPr>
+      <w:r>
+        <w:rPr>
+          <w:rFonts w:ascii="Calibri" w:hAnsi="Calibri" w:eastAsia="Calibri"/>
+          <w:b/>
+          <w:sz w:val="22"/>
+        </w:rPr>
+        <w:t>R07 + R08 nesting</w:t>
+      </w:r>
+      <w:r>
+        <w:rPr>
+          <w:rFonts w:ascii="Calibri" w:hAnsi="Calibri" w:eastAsia="Calibri"/>
+          <w:b w:val="0"/>
+          <w:sz w:val="22"/>
+        </w:rPr>
+        <w:t xml:space="preserve"> — parent clickable containers flagged when child text already names the control.</w:t>
+      </w:r>
+    </w:p>
+    <w:p>
+      <w:pPr>
+        <w:pStyle w:val="ListNumber"/>
+      </w:pPr>
+      <w:r>
+        <w:rPr>
+          <w:rFonts w:ascii="Calibri" w:hAnsi="Calibri" w:eastAsia="Calibri"/>
+          <w:b/>
+          <w:sz w:val="22"/>
+        </w:rPr>
+        <w:t>R01 contrast on secondary chrome</w:t>
+      </w:r>
+      <w:r>
+        <w:rPr>
+          <w:rFonts w:ascii="Calibri" w:hAnsi="Calibri" w:eastAsia="Calibri"/>
+          <w:b w:val="0"/>
+          <w:sz w:val="22"/>
+        </w:rPr>
+        <w:t xml:space="preserve"> — muted hints/labels borderline by design.</w:t>
+      </w:r>
+    </w:p>
+    <w:p>
+      <w:pPr>
+        <w:pStyle w:val="ListNumber"/>
+      </w:pPr>
+      <w:r>
+        <w:rPr>
+          <w:rFonts w:ascii="Calibri" w:hAnsi="Calibri" w:eastAsia="Calibri"/>
+          <w:b/>
+          <w:sz w:val="22"/>
+        </w:rPr>
+        <w:t>R30 density</w:t>
+      </w:r>
+      <w:r>
+        <w:rPr>
+          <w:rFonts w:ascii="Calibri" w:hAnsi="Calibri" w:eastAsia="Calibri"/>
+          <w:b w:val="0"/>
+          <w:sz w:val="22"/>
+        </w:rPr>
+        <w:t xml:space="preserve"> — chat/list screens produce overlap noise from scroll siblings.</w:t>
+      </w:r>
+    </w:p>
+    <w:p>
+      <w:pPr>
+        <w:pStyle w:val="Heading2"/>
+      </w:pPr>
+      <w:r>
+        <w:t>Recurring miss themes</w:t>
+      </w:r>
+    </w:p>
+    <w:p>
+      <w:pPr>
+        <w:pStyle w:val="ListNumber"/>
+      </w:pPr>
+      <w:r>
+        <w:rPr>
+          <w:rFonts w:ascii="Calibri" w:hAnsi="Calibri" w:eastAsia="Calibri"/>
+          <w:b w:val="0"/>
+          <w:sz w:val="22"/>
+        </w:rPr>
+        <w:t>Live/dynamic announcements (chat unread, badges) not in static XML.</w:t>
+      </w:r>
+    </w:p>
+    <w:p>
+      <w:pPr>
+        <w:pStyle w:val="ListNumber"/>
+      </w:pPr>
+      <w:r>
+        <w:rPr>
+          <w:rFonts w:ascii="Calibri" w:hAnsi="Calibri" w:eastAsia="Calibri"/>
+          <w:b w:val="0"/>
+          <w:sz w:val="22"/>
+        </w:rPr>
+        <w:t>Field–error association on auth forms.</w:t>
+      </w:r>
+    </w:p>
+    <w:p>
+      <w:pPr>
+        <w:pStyle w:val="ListNumber"/>
+      </w:pPr>
+      <w:r>
+        <w:rPr>
+          <w:rFonts w:ascii="Calibri" w:hAnsi="Calibri" w:eastAsia="Calibri"/>
+          <w:b w:val="0"/>
+          <w:sz w:val="22"/>
+        </w:rPr>
+        <w:t>Selected state on bottom nav / tabs when XML lacks state attrs.</w:t>
+      </w:r>
+    </w:p>
+    <w:p>
+      <w:pPr>
+        <w:pStyle w:val="Heading2"/>
+      </w:pPr>
+      <w:r>
+        <w:t>Week 6 companion work (Noor) — auth, mail, credentials</w:t>
+      </w:r>
+    </w:p>
+    <w:p>
+      <w:r>
+        <w:rPr>
+          <w:rFonts w:ascii="Calibri" w:hAnsi="Calibri" w:eastAsia="Calibri"/>
+          <w:b w:val="0"/>
+          <w:sz w:val="22"/>
+        </w:rPr>
+        <w:t>The evaluation sheet is one Week 6 deliverable. The same week also closed the auth/mail stretch so the Friday demo path (signup → upload → report → records) is end-to-end.</w:t>
+      </w:r>
+    </w:p>
+    <w:tbl>
+      <w:tblPr>
+        <w:tblStyle w:val="TableGrid"/>
+        <w:tblW w:type="auto" w:w="0"/>
+        <w:tblLayout w:type="autofit"/>
+        <w:tblLook w:firstColumn="1" w:firstRow="1" w:lastColumn="0" w:lastRow="0" w:noHBand="0" w:noVBand="1" w:val="04A0"/>
+      </w:tblPr>
+      <w:tblGrid>
+        <w:gridCol w:w="4752"/>
+        <w:gridCol w:w="4752"/>
+      </w:tblGrid>
+      <w:tr>
+        <w:tc>
+          <w:tcPr>
+            <w:tcW w:type="dxa" w:w="4752"/>
+            <w:shd w:fill="1E3A5F" w:val="clear"/>
+          </w:tcPr>
+          <w:p>
+            <w:pPr>
+              <w:spacing w:before="60" w:after="60"/>
+            </w:pPr>
+            <w:r/>
+            <w:r>
+              <w:rPr>
+                <w:rFonts w:ascii="Calibri" w:hAnsi="Calibri" w:eastAsia="Calibri"/>
+                <w:b/>
+                <w:color w:val="FFFFFF"/>
+                <w:sz w:val="20"/>
+              </w:rPr>
+              <w:t>Area</w:t>
+            </w:r>
+          </w:p>
+        </w:tc>
+        <w:tc>
+          <w:tcPr>
+            <w:tcW w:type="dxa" w:w="4752"/>
+            <w:shd w:fill="1E3A5F" w:val="clear"/>
+          </w:tcPr>
+          <w:p>
+            <w:pPr>
+              <w:spacing w:before="60" w:after="60"/>
+            </w:pPr>
+            <w:r/>
+            <w:r>
+              <w:rPr>
+                <w:rFonts w:ascii="Calibri" w:hAnsi="Calibri" w:eastAsia="Calibri"/>
+                <w:b/>
+                <w:color w:val="FFFFFF"/>
+                <w:sz w:val="20"/>
+              </w:rPr>
+              <w:t>What was done</w:t>
             </w:r>
           </w:p>
         </w:tc>
@@ -353,65 +1210,1163 @@
       <w:tr>
         <w:tc>
           <w:tcPr>
-            <w:tcW w:type="dxa" w:w="4320"/>
+            <w:tcW w:type="dxa" w:w="4752"/>
           </w:tcPr>
           <w:p>
+            <w:pPr>
+              <w:spacing w:before="60" w:after="60"/>
+            </w:pPr>
+            <w:r/>
             <w:r>
-              <w:t>`reviewer`</w:t>
+              <w:rPr>
+                <w:rFonts w:ascii="Calibri" w:hAnsi="Calibri" w:eastAsia="Calibri"/>
+                <w:b/>
+                <w:sz w:val="20"/>
+              </w:rPr>
+              <w:t>Sign Up / Log In</w:t>
             </w:r>
           </w:p>
         </w:tc>
         <w:tc>
           <w:tcPr>
-            <w:tcW w:type="dxa" w:w="4320"/>
+            <w:tcW w:type="dxa" w:w="4752"/>
           </w:tcPr>
           <w:p>
+            <w:pPr>
+              <w:spacing w:before="60" w:after="60"/>
+            </w:pPr>
+            <w:r/>
             <w:r>
-              <w:t>Default `Noor`</w:t>
+              <w:rPr>
+                <w:rFonts w:ascii="Calibri" w:hAnsi="Calibri" w:eastAsia="Calibri"/>
+                <w:b w:val="0"/>
+                <w:sz w:val="20"/>
+              </w:rPr>
+              <w:t xml:space="preserve">JWT register + login; optional </w:t>
+            </w:r>
+            <w:r>
+              <w:rPr>
+                <w:rFonts w:ascii="Consolas" w:hAnsi="Consolas" w:eastAsia="Consolas"/>
+                <w:b w:val="0"/>
+                <w:color w:val="1E3A5F"/>
+                <w:sz w:val="18"/>
+              </w:rPr>
+              <w:t>name</w:t>
+            </w:r>
+            <w:r>
+              <w:rPr>
+                <w:rFonts w:ascii="Calibri" w:hAnsi="Calibri" w:eastAsia="Calibri"/>
+                <w:b w:val="0"/>
+                <w:sz w:val="20"/>
+              </w:rPr>
+              <w:t xml:space="preserve">; profile </w:t>
+            </w:r>
+            <w:r>
+              <w:rPr>
+                <w:rFonts w:ascii="Calibri" w:hAnsi="Calibri" w:eastAsia="Calibri"/>
+                <w:b/>
+                <w:sz w:val="20"/>
+              </w:rPr>
+              <w:t>initials</w:t>
+            </w:r>
+            <w:r>
+              <w:rPr>
+                <w:rFonts w:ascii="Calibri" w:hAnsi="Calibri" w:eastAsia="Calibri"/>
+                <w:b w:val="0"/>
+                <w:sz w:val="20"/>
+              </w:rPr>
+              <w:t xml:space="preserve"> via </w:t>
+            </w:r>
+            <w:r>
+              <w:rPr>
+                <w:rFonts w:ascii="Consolas" w:hAnsi="Consolas" w:eastAsia="Consolas"/>
+                <w:b w:val="0"/>
+                <w:color w:val="1E3A5F"/>
+                <w:sz w:val="18"/>
+              </w:rPr>
+              <w:t>UserAvatar</w:t>
+            </w:r>
+            <w:r>
+              <w:rPr>
+                <w:rFonts w:ascii="Calibri" w:hAnsi="Calibri" w:eastAsia="Calibri"/>
+                <w:b w:val="0"/>
+                <w:sz w:val="20"/>
+              </w:rPr>
+              <w:t xml:space="preserve"> (not hardcoded)</w:t>
+            </w:r>
+          </w:p>
+        </w:tc>
+      </w:tr>
+      <w:tr>
+        <w:tc>
+          <w:tcPr>
+            <w:tcW w:type="dxa" w:w="4752"/>
+          </w:tcPr>
+          <w:p>
+            <w:pPr>
+              <w:spacing w:before="60" w:after="60"/>
+            </w:pPr>
+            <w:r/>
+            <w:r>
+              <w:rPr>
+                <w:rFonts w:ascii="Calibri" w:hAnsi="Calibri" w:eastAsia="Calibri"/>
+                <w:b/>
+                <w:sz w:val="20"/>
+              </w:rPr>
+              <w:t>Forgot / OTP / Reset</w:t>
+            </w:r>
+          </w:p>
+        </w:tc>
+        <w:tc>
+          <w:tcPr>
+            <w:tcW w:type="dxa" w:w="4752"/>
+          </w:tcPr>
+          <w:p>
+            <w:pPr>
+              <w:spacing w:before="60" w:after="60"/>
+            </w:pPr>
+            <w:r/>
+            <w:r>
+              <w:rPr>
+                <w:rFonts w:ascii="Consolas" w:hAnsi="Consolas" w:eastAsia="Consolas"/>
+                <w:b w:val="0"/>
+                <w:color w:val="1E3A5F"/>
+                <w:sz w:val="18"/>
+              </w:rPr>
+              <w:t>POST /auth/forgot-password</w:t>
+            </w:r>
+            <w:r>
+              <w:rPr>
+                <w:rFonts w:ascii="Calibri" w:hAnsi="Calibri" w:eastAsia="Calibri"/>
+                <w:b w:val="0"/>
+                <w:sz w:val="20"/>
+              </w:rPr>
+              <w:t xml:space="preserve">, </w:t>
+            </w:r>
+            <w:r>
+              <w:rPr>
+                <w:rFonts w:ascii="Consolas" w:hAnsi="Consolas" w:eastAsia="Consolas"/>
+                <w:b w:val="0"/>
+                <w:color w:val="1E3A5F"/>
+                <w:sz w:val="18"/>
+              </w:rPr>
+              <w:t>resend-otp</w:t>
+            </w:r>
+            <w:r>
+              <w:rPr>
+                <w:rFonts w:ascii="Calibri" w:hAnsi="Calibri" w:eastAsia="Calibri"/>
+                <w:b w:val="0"/>
+                <w:sz w:val="20"/>
+              </w:rPr>
+              <w:t xml:space="preserve">, </w:t>
+            </w:r>
+            <w:r>
+              <w:rPr>
+                <w:rFonts w:ascii="Consolas" w:hAnsi="Consolas" w:eastAsia="Consolas"/>
+                <w:b w:val="0"/>
+                <w:color w:val="1E3A5F"/>
+                <w:sz w:val="18"/>
+              </w:rPr>
+              <w:t>verify-otp</w:t>
+            </w:r>
+            <w:r>
+              <w:rPr>
+                <w:rFonts w:ascii="Calibri" w:hAnsi="Calibri" w:eastAsia="Calibri"/>
+                <w:b w:val="0"/>
+                <w:sz w:val="20"/>
+              </w:rPr>
+              <w:t xml:space="preserve">, </w:t>
+            </w:r>
+            <w:r>
+              <w:rPr>
+                <w:rFonts w:ascii="Consolas" w:hAnsi="Consolas" w:eastAsia="Consolas"/>
+                <w:b w:val="0"/>
+                <w:color w:val="1E3A5F"/>
+                <w:sz w:val="18"/>
+              </w:rPr>
+              <w:t>reset-password</w:t>
+            </w:r>
+            <w:r>
+              <w:rPr>
+                <w:rFonts w:ascii="Calibri" w:hAnsi="Calibri" w:eastAsia="Calibri"/>
+                <w:b w:val="0"/>
+                <w:sz w:val="20"/>
+              </w:rPr>
+              <w:t>; 6-digit OTP with TTL</w:t>
+            </w:r>
+          </w:p>
+        </w:tc>
+      </w:tr>
+      <w:tr>
+        <w:tc>
+          <w:tcPr>
+            <w:tcW w:type="dxa" w:w="4752"/>
+          </w:tcPr>
+          <w:p>
+            <w:pPr>
+              <w:spacing w:before="60" w:after="60"/>
+            </w:pPr>
+            <w:r/>
+            <w:r>
+              <w:rPr>
+                <w:rFonts w:ascii="Calibri" w:hAnsi="Calibri" w:eastAsia="Calibri"/>
+                <w:b/>
+                <w:sz w:val="20"/>
+              </w:rPr>
+              <w:t>Email OTP (SMTP)</w:t>
+            </w:r>
+          </w:p>
+        </w:tc>
+        <w:tc>
+          <w:tcPr>
+            <w:tcW w:type="dxa" w:w="4752"/>
+          </w:tcPr>
+          <w:p>
+            <w:pPr>
+              <w:spacing w:before="60" w:after="60"/>
+            </w:pPr>
+            <w:r/>
+            <w:r>
+              <w:rPr>
+                <w:rFonts w:ascii="Calibri" w:hAnsi="Calibri" w:eastAsia="Calibri"/>
+                <w:b w:val="0"/>
+                <w:sz w:val="20"/>
+              </w:rPr>
+              <w:t xml:space="preserve">Gmail SMTP App Password via </w:t>
+            </w:r>
+            <w:r>
+              <w:rPr>
+                <w:rFonts w:ascii="Consolas" w:hAnsi="Consolas" w:eastAsia="Consolas"/>
+                <w:b w:val="0"/>
+                <w:color w:val="1E3A5F"/>
+                <w:sz w:val="18"/>
+              </w:rPr>
+              <w:t>.env</w:t>
+            </w:r>
+            <w:r>
+              <w:rPr>
+                <w:rFonts w:ascii="Calibri" w:hAnsi="Calibri" w:eastAsia="Calibri"/>
+                <w:b w:val="0"/>
+                <w:sz w:val="20"/>
+              </w:rPr>
+              <w:t xml:space="preserve"> (</w:t>
+            </w:r>
+            <w:r>
+              <w:rPr>
+                <w:rFonts w:ascii="Consolas" w:hAnsi="Consolas" w:eastAsia="Consolas"/>
+                <w:b w:val="0"/>
+                <w:color w:val="1E3A5F"/>
+                <w:sz w:val="18"/>
+              </w:rPr>
+              <w:t>SMTP_HOST</w:t>
+            </w:r>
+            <w:r>
+              <w:rPr>
+                <w:rFonts w:ascii="Calibri" w:hAnsi="Calibri" w:eastAsia="Calibri"/>
+                <w:b w:val="0"/>
+                <w:sz w:val="20"/>
+              </w:rPr>
+              <w:t xml:space="preserve">, </w:t>
+            </w:r>
+            <w:r>
+              <w:rPr>
+                <w:rFonts w:ascii="Consolas" w:hAnsi="Consolas" w:eastAsia="Consolas"/>
+                <w:b w:val="0"/>
+                <w:color w:val="1E3A5F"/>
+                <w:sz w:val="18"/>
+              </w:rPr>
+              <w:t>SMTP_USER</w:t>
+            </w:r>
+            <w:r>
+              <w:rPr>
+                <w:rFonts w:ascii="Calibri" w:hAnsi="Calibri" w:eastAsia="Calibri"/>
+                <w:b w:val="0"/>
+                <w:sz w:val="20"/>
+              </w:rPr>
+              <w:t xml:space="preserve">, </w:t>
+            </w:r>
+            <w:r>
+              <w:rPr>
+                <w:rFonts w:ascii="Consolas" w:hAnsi="Consolas" w:eastAsia="Consolas"/>
+                <w:b w:val="0"/>
+                <w:color w:val="1E3A5F"/>
+                <w:sz w:val="18"/>
+              </w:rPr>
+              <w:t>SMTP_FROM</w:t>
+            </w:r>
+            <w:r>
+              <w:rPr>
+                <w:rFonts w:ascii="Calibri" w:hAnsi="Calibri" w:eastAsia="Calibri"/>
+                <w:b w:val="0"/>
+                <w:sz w:val="20"/>
+              </w:rPr>
+              <w:t xml:space="preserve">, </w:t>
+            </w:r>
+            <w:r>
+              <w:rPr>
+                <w:rFonts w:ascii="Consolas" w:hAnsi="Consolas" w:eastAsia="Consolas"/>
+                <w:b w:val="0"/>
+                <w:color w:val="1E3A5F"/>
+                <w:sz w:val="18"/>
+              </w:rPr>
+              <w:t>SMTP_PASSWORD</w:t>
+            </w:r>
+            <w:r>
+              <w:rPr>
+                <w:rFonts w:ascii="Calibri" w:hAnsi="Calibri" w:eastAsia="Calibri"/>
+                <w:b w:val="0"/>
+                <w:sz w:val="20"/>
+              </w:rPr>
+              <w:t>); real mail delivery verified</w:t>
+            </w:r>
+          </w:p>
+        </w:tc>
+      </w:tr>
+      <w:tr>
+        <w:tc>
+          <w:tcPr>
+            <w:tcW w:type="dxa" w:w="4752"/>
+          </w:tcPr>
+          <w:p>
+            <w:pPr>
+              <w:spacing w:before="60" w:after="60"/>
+            </w:pPr>
+            <w:r/>
+            <w:r>
+              <w:rPr>
+                <w:rFonts w:ascii="Calibri" w:hAnsi="Calibri" w:eastAsia="Calibri"/>
+                <w:b/>
+                <w:sz w:val="20"/>
+              </w:rPr>
+              <w:t>Recipient domains</w:t>
+            </w:r>
+          </w:p>
+        </w:tc>
+        <w:tc>
+          <w:tcPr>
+            <w:tcW w:type="dxa" w:w="4752"/>
+          </w:tcPr>
+          <w:p>
+            <w:pPr>
+              <w:spacing w:before="60" w:after="60"/>
+            </w:pPr>
+            <w:r/>
+            <w:r>
+              <w:rPr>
+                <w:rFonts w:ascii="Calibri" w:hAnsi="Calibri" w:eastAsia="Calibri"/>
+                <w:b w:val="0"/>
+                <w:sz w:val="20"/>
+              </w:rPr>
+              <w:t xml:space="preserve">Signup / forgot-password accept </w:t>
+            </w:r>
+            <w:r>
+              <w:rPr>
+                <w:rFonts w:ascii="Calibri" w:hAnsi="Calibri" w:eastAsia="Calibri"/>
+                <w:b/>
+                <w:sz w:val="20"/>
+              </w:rPr>
+              <w:t>any valid email</w:t>
+            </w:r>
+            <w:r>
+              <w:rPr>
+                <w:rFonts w:ascii="Calibri" w:hAnsi="Calibri" w:eastAsia="Calibri"/>
+                <w:b w:val="0"/>
+                <w:sz w:val="20"/>
+              </w:rPr>
+              <w:t xml:space="preserve"> (Yahoo, Outlook, university/education </w:t>
+            </w:r>
+            <w:r>
+              <w:rPr>
+                <w:rFonts w:ascii="Consolas" w:hAnsi="Consolas" w:eastAsia="Consolas"/>
+                <w:b w:val="0"/>
+                <w:color w:val="1E3A5F"/>
+                <w:sz w:val="18"/>
+              </w:rPr>
+              <w:t>.edu</w:t>
+            </w:r>
+            <w:r>
+              <w:rPr>
+                <w:rFonts w:ascii="Calibri" w:hAnsi="Calibri" w:eastAsia="Calibri"/>
+                <w:b w:val="0"/>
+                <w:sz w:val="20"/>
+              </w:rPr>
+              <w:t>, etc.) — sender is Gmail; recipients are not Gmail-only</w:t>
+            </w:r>
+          </w:p>
+        </w:tc>
+      </w:tr>
+      <w:tr>
+        <w:tc>
+          <w:tcPr>
+            <w:tcW w:type="dxa" w:w="4752"/>
+          </w:tcPr>
+          <w:p>
+            <w:pPr>
+              <w:spacing w:before="60" w:after="60"/>
+            </w:pPr>
+            <w:r/>
+            <w:r>
+              <w:rPr>
+                <w:rFonts w:ascii="Calibri" w:hAnsi="Calibri" w:eastAsia="Calibri"/>
+                <w:b/>
+                <w:sz w:val="20"/>
+              </w:rPr>
+              <w:t>Google OAuth</w:t>
+            </w:r>
+          </w:p>
+        </w:tc>
+        <w:tc>
+          <w:tcPr>
+            <w:tcW w:type="dxa" w:w="4752"/>
+          </w:tcPr>
+          <w:p>
+            <w:pPr>
+              <w:spacing w:before="60" w:after="60"/>
+            </w:pPr>
+            <w:r/>
+            <w:r>
+              <w:rPr>
+                <w:rFonts w:ascii="Consolas" w:hAnsi="Consolas" w:eastAsia="Consolas"/>
+                <w:b w:val="0"/>
+                <w:color w:val="1E3A5F"/>
+                <w:sz w:val="18"/>
+              </w:rPr>
+              <w:t>POST /auth/google</w:t>
+            </w:r>
+            <w:r>
+              <w:rPr>
+                <w:rFonts w:ascii="Calibri" w:hAnsi="Calibri" w:eastAsia="Calibri"/>
+                <w:b w:val="0"/>
+                <w:sz w:val="20"/>
+              </w:rPr>
+              <w:t xml:space="preserve"> + GIS frontend; </w:t>
+            </w:r>
+            <w:r>
+              <w:rPr>
+                <w:rFonts w:ascii="Consolas" w:hAnsi="Consolas" w:eastAsia="Consolas"/>
+                <w:b w:val="0"/>
+                <w:color w:val="1E3A5F"/>
+                <w:sz w:val="18"/>
+              </w:rPr>
+              <w:t>GOOGLE_CLIENT_ID</w:t>
+            </w:r>
+            <w:r>
+              <w:rPr>
+                <w:rFonts w:ascii="Calibri" w:hAnsi="Calibri" w:eastAsia="Calibri"/>
+                <w:b w:val="0"/>
+                <w:sz w:val="20"/>
+              </w:rPr>
+              <w:t xml:space="preserve"> in </w:t>
+            </w:r>
+            <w:r>
+              <w:rPr>
+                <w:rFonts w:ascii="Consolas" w:hAnsi="Consolas" w:eastAsia="Consolas"/>
+                <w:b w:val="0"/>
+                <w:color w:val="1E3A5F"/>
+                <w:sz w:val="18"/>
+              </w:rPr>
+              <w:t>.env</w:t>
+            </w:r>
+            <w:r>
+              <w:rPr>
+                <w:rFonts w:ascii="Calibri" w:hAnsi="Calibri" w:eastAsia="Calibri"/>
+                <w:b w:val="0"/>
+                <w:sz w:val="20"/>
+              </w:rPr>
+              <w:t xml:space="preserve"> / </w:t>
+            </w:r>
+            <w:r>
+              <w:rPr>
+                <w:rFonts w:ascii="Consolas" w:hAnsi="Consolas" w:eastAsia="Consolas"/>
+                <w:b w:val="0"/>
+                <w:color w:val="1E3A5F"/>
+                <w:sz w:val="18"/>
+              </w:rPr>
+              <w:t>.env.example</w:t>
+            </w:r>
+          </w:p>
+        </w:tc>
+      </w:tr>
+      <w:tr>
+        <w:tc>
+          <w:tcPr>
+            <w:tcW w:type="dxa" w:w="4752"/>
+          </w:tcPr>
+          <w:p>
+            <w:pPr>
+              <w:spacing w:before="60" w:after="60"/>
+            </w:pPr>
+            <w:r/>
+            <w:r>
+              <w:rPr>
+                <w:rFonts w:ascii="Calibri" w:hAnsi="Calibri" w:eastAsia="Calibri"/>
+                <w:b/>
+                <w:sz w:val="20"/>
+              </w:rPr>
+              <w:t>Dev vs prod OTP UI</w:t>
+            </w:r>
+          </w:p>
+        </w:tc>
+        <w:tc>
+          <w:tcPr>
+            <w:tcW w:type="dxa" w:w="4752"/>
+          </w:tcPr>
+          <w:p>
+            <w:pPr>
+              <w:spacing w:before="60" w:after="60"/>
+            </w:pPr>
+            <w:r/>
+            <w:r>
+              <w:rPr>
+                <w:rFonts w:ascii="Consolas" w:hAnsi="Consolas" w:eastAsia="Consolas"/>
+                <w:b w:val="0"/>
+                <w:color w:val="1E3A5F"/>
+                <w:sz w:val="18"/>
+              </w:rPr>
+              <w:t>AUTH_DEV_SHOW_OTP=0</w:t>
+            </w:r>
+            <w:r>
+              <w:rPr>
+                <w:rFonts w:ascii="Calibri" w:hAnsi="Calibri" w:eastAsia="Calibri"/>
+                <w:b w:val="0"/>
+                <w:sz w:val="20"/>
+              </w:rPr>
+              <w:t xml:space="preserve"> hides on-screen debug code when SMTP works; API may still return </w:t>
+            </w:r>
+            <w:r>
+              <w:rPr>
+                <w:rFonts w:ascii="Consolas" w:hAnsi="Consolas" w:eastAsia="Consolas"/>
+                <w:b w:val="0"/>
+                <w:color w:val="1E3A5F"/>
+                <w:sz w:val="18"/>
+              </w:rPr>
+              <w:t>email_sent</w:t>
+            </w:r>
+          </w:p>
+        </w:tc>
+      </w:tr>
+      <w:tr>
+        <w:tc>
+          <w:tcPr>
+            <w:tcW w:type="dxa" w:w="4752"/>
+          </w:tcPr>
+          <w:p>
+            <w:pPr>
+              <w:spacing w:before="60" w:after="60"/>
+            </w:pPr>
+            <w:r/>
+            <w:r>
+              <w:rPr>
+                <w:rFonts w:ascii="Calibri" w:hAnsi="Calibri" w:eastAsia="Calibri"/>
+                <w:b/>
+                <w:sz w:val="20"/>
+              </w:rPr>
+              <w:t>Other settings</w:t>
+            </w:r>
+          </w:p>
+        </w:tc>
+        <w:tc>
+          <w:tcPr>
+            <w:tcW w:type="dxa" w:w="4752"/>
+          </w:tcPr>
+          <w:p>
+            <w:pPr>
+              <w:spacing w:before="60" w:after="60"/>
+            </w:pPr>
+            <w:r/>
+            <w:r>
+              <w:rPr>
+                <w:rFonts w:ascii="Consolas" w:hAnsi="Consolas" w:eastAsia="Consolas"/>
+                <w:b w:val="0"/>
+                <w:color w:val="1E3A5F"/>
+                <w:sz w:val="18"/>
+              </w:rPr>
+              <w:t>JWT_SECRET</w:t>
+            </w:r>
+            <w:r>
+              <w:rPr>
+                <w:rFonts w:ascii="Calibri" w:hAnsi="Calibri" w:eastAsia="Calibri"/>
+                <w:b w:val="0"/>
+                <w:sz w:val="20"/>
+              </w:rPr>
+              <w:t xml:space="preserve">; </w:t>
+            </w:r>
+            <w:r>
+              <w:rPr>
+                <w:rFonts w:ascii="Consolas" w:hAnsi="Consolas" w:eastAsia="Consolas"/>
+                <w:b w:val="0"/>
+                <w:color w:val="1E3A5F"/>
+                <w:sz w:val="18"/>
+              </w:rPr>
+              <w:t>load_dotenv(..., override=True)</w:t>
+            </w:r>
+            <w:r>
+              <w:rPr>
+                <w:rFonts w:ascii="Calibri" w:hAnsi="Calibri" w:eastAsia="Calibri"/>
+                <w:b w:val="0"/>
+                <w:sz w:val="20"/>
+              </w:rPr>
+              <w:t xml:space="preserve"> so restarted servers pick up SMTP/OAuth; frontend </w:t>
+            </w:r>
+            <w:r>
+              <w:rPr>
+                <w:rFonts w:ascii="Consolas" w:hAnsi="Consolas" w:eastAsia="Consolas"/>
+                <w:b w:val="0"/>
+                <w:color w:val="1E3A5F"/>
+                <w:sz w:val="18"/>
+              </w:rPr>
+              <w:t>VITE_API_BASE</w:t>
+            </w:r>
+            <w:r>
+              <w:rPr>
+                <w:rFonts w:ascii="Calibri" w:hAnsi="Calibri" w:eastAsia="Calibri"/>
+                <w:b w:val="0"/>
+                <w:sz w:val="20"/>
+              </w:rPr>
+              <w:t xml:space="preserve"> points at live backend</w:t>
+            </w:r>
+          </w:p>
+        </w:tc>
+      </w:tr>
+      <w:tr>
+        <w:tc>
+          <w:tcPr>
+            <w:tcW w:type="dxa" w:w="4752"/>
+          </w:tcPr>
+          <w:p>
+            <w:pPr>
+              <w:spacing w:before="60" w:after="60"/>
+            </w:pPr>
+            <w:r/>
+            <w:r>
+              <w:rPr>
+                <w:rFonts w:ascii="Calibri" w:hAnsi="Calibri" w:eastAsia="Calibri"/>
+                <w:b/>
+                <w:sz w:val="20"/>
+              </w:rPr>
+              <w:t>Report export fix</w:t>
+            </w:r>
+          </w:p>
+        </w:tc>
+        <w:tc>
+          <w:tcPr>
+            <w:tcW w:type="dxa" w:w="4752"/>
+          </w:tcPr>
+          <w:p>
+            <w:pPr>
+              <w:spacing w:before="60" w:after="60"/>
+            </w:pPr>
+            <w:r/>
+            <w:r>
+              <w:rPr>
+                <w:rFonts w:ascii="Calibri" w:hAnsi="Calibri" w:eastAsia="Calibri"/>
+                <w:b w:val="0"/>
+                <w:sz w:val="20"/>
+              </w:rPr>
+              <w:t xml:space="preserve">Persist upload screenshot/XML for HTML/PDF; Jinja </w:t>
+            </w:r>
+            <w:r>
+              <w:rPr>
+                <w:rFonts w:ascii="Consolas" w:hAnsi="Consolas" w:eastAsia="Consolas"/>
+                <w:b w:val="0"/>
+                <w:color w:val="1E3A5F"/>
+                <w:sz w:val="18"/>
+              </w:rPr>
+              <w:t>autoescape</w:t>
+            </w:r>
+            <w:r>
+              <w:rPr>
+                <w:rFonts w:ascii="Calibri" w:hAnsi="Calibri" w:eastAsia="Calibri"/>
+                <w:b w:val="0"/>
+                <w:sz w:val="20"/>
+              </w:rPr>
+              <w:t xml:space="preserve"> so XML/violations render</w:t>
+            </w:r>
+          </w:p>
+        </w:tc>
+      </w:tr>
+      <w:tr>
+        <w:tc>
+          <w:tcPr>
+            <w:tcW w:type="dxa" w:w="4752"/>
+          </w:tcPr>
+          <w:p>
+            <w:pPr>
+              <w:spacing w:before="60" w:after="60"/>
+            </w:pPr>
+            <w:r/>
+            <w:r>
+              <w:rPr>
+                <w:rFonts w:ascii="Calibri" w:hAnsi="Calibri" w:eastAsia="Calibri"/>
+                <w:b/>
+                <w:sz w:val="20"/>
+              </w:rPr>
+              <w:t>Records</w:t>
+            </w:r>
+          </w:p>
+        </w:tc>
+        <w:tc>
+          <w:tcPr>
+            <w:tcW w:type="dxa" w:w="4752"/>
+          </w:tcPr>
+          <w:p>
+            <w:pPr>
+              <w:spacing w:before="60" w:after="60"/>
+            </w:pPr>
+            <w:r/>
+            <w:r>
+              <w:rPr>
+                <w:rFonts w:ascii="Calibri" w:hAnsi="Calibri" w:eastAsia="Calibri"/>
+                <w:b w:val="0"/>
+                <w:sz w:val="20"/>
+              </w:rPr>
+              <w:t xml:space="preserve">Live API with screenshot/XML </w:t>
+            </w:r>
+            <w:r>
+              <w:rPr>
+                <w:rFonts w:ascii="Calibri" w:hAnsi="Calibri" w:eastAsia="Calibri"/>
+                <w:b/>
+                <w:sz w:val="20"/>
+              </w:rPr>
+              <w:t>names</w:t>
+            </w:r>
+            <w:r>
+              <w:rPr>
+                <w:rFonts w:ascii="Calibri" w:hAnsi="Calibri" w:eastAsia="Calibri"/>
+                <w:b w:val="0"/>
+                <w:sz w:val="20"/>
+              </w:rPr>
+              <w:t xml:space="preserve"> + </w:t>
+            </w:r>
+            <w:r>
+              <w:rPr>
+                <w:rFonts w:ascii="Consolas" w:hAnsi="Consolas" w:eastAsia="Consolas"/>
+                <w:b w:val="0"/>
+                <w:color w:val="1E3A5F"/>
+                <w:sz w:val="18"/>
+              </w:rPr>
+              <w:t>accessibility_score</w:t>
+            </w:r>
+            <w:r>
+              <w:rPr>
+                <w:rFonts w:ascii="Calibri" w:hAnsi="Calibri" w:eastAsia="Calibri"/>
+                <w:b w:val="0"/>
+                <w:sz w:val="20"/>
+              </w:rPr>
+              <w:t xml:space="preserve"> columns</w:t>
+            </w:r>
+          </w:p>
+        </w:tc>
+      </w:tr>
+      <w:tr>
+        <w:tc>
+          <w:tcPr>
+            <w:tcW w:type="dxa" w:w="4752"/>
+          </w:tcPr>
+          <w:p>
+            <w:pPr>
+              <w:spacing w:before="60" w:after="60"/>
+            </w:pPr>
+            <w:r/>
+            <w:r>
+              <w:rPr>
+                <w:rFonts w:ascii="Calibri" w:hAnsi="Calibri" w:eastAsia="Calibri"/>
+                <w:b/>
+                <w:sz w:val="20"/>
+              </w:rPr>
+              <w:t>Validation</w:t>
+            </w:r>
+          </w:p>
+        </w:tc>
+        <w:tc>
+          <w:tcPr>
+            <w:tcW w:type="dxa" w:w="4752"/>
+          </w:tcPr>
+          <w:p>
+            <w:pPr>
+              <w:spacing w:before="60" w:after="60"/>
+            </w:pPr>
+            <w:r/>
+            <w:r>
+              <w:rPr>
+                <w:rFonts w:ascii="Calibri" w:hAnsi="Calibri" w:eastAsia="Calibri"/>
+                <w:b w:val="0"/>
+                <w:sz w:val="20"/>
+              </w:rPr>
+              <w:t>`outputs/validation_logs/noor_week6_*.md</w:t>
             </w:r>
           </w:p>
         </w:tc>
       </w:tr>
     </w:tbl>
+    <w:p/>
+    <w:p>
+      <w:r>
+        <w:rPr>
+          <w:rFonts w:ascii="Calibri" w:hAnsi="Calibri" w:eastAsia="Calibri"/>
+          <w:b/>
+          <w:sz w:val="22"/>
+        </w:rPr>
+        <w:t>Credentials (documented, not committed secrets):</w:t>
+      </w:r>
+      <w:r>
+        <w:rPr>
+          <w:rFonts w:ascii="Calibri" w:hAnsi="Calibri" w:eastAsia="Calibri"/>
+          <w:b w:val="0"/>
+          <w:sz w:val="22"/>
+        </w:rPr>
+        <w:t xml:space="preserve"> configure locally in </w:t>
+      </w:r>
+      <w:r>
+        <w:rPr>
+          <w:rFonts w:ascii="Consolas" w:hAnsi="Consolas" w:eastAsia="Consolas"/>
+          <w:b w:val="0"/>
+          <w:color w:val="1E3A5F"/>
+          <w:sz w:val="18"/>
+        </w:rPr>
+        <w:t>.env</w:t>
+      </w:r>
+      <w:r>
+        <w:rPr>
+          <w:rFonts w:ascii="Calibri" w:hAnsi="Calibri" w:eastAsia="Calibri"/>
+          <w:b w:val="0"/>
+          <w:sz w:val="22"/>
+        </w:rPr>
+        <w:t xml:space="preserve"> from </w:t>
+      </w:r>
+      <w:r>
+        <w:rPr>
+          <w:rFonts w:ascii="Consolas" w:hAnsi="Consolas" w:eastAsia="Consolas"/>
+          <w:b w:val="0"/>
+          <w:color w:val="1E3A5F"/>
+          <w:sz w:val="18"/>
+        </w:rPr>
+        <w:t>.env.example</w:t>
+      </w:r>
+      <w:r>
+        <w:rPr>
+          <w:rFonts w:ascii="Calibri" w:hAnsi="Calibri" w:eastAsia="Calibri"/>
+          <w:b w:val="0"/>
+          <w:sz w:val="22"/>
+        </w:rPr>
+        <w:t xml:space="preserve">. Do </w:t>
+      </w:r>
+      <w:r>
+        <w:rPr>
+          <w:rFonts w:ascii="Calibri" w:hAnsi="Calibri" w:eastAsia="Calibri"/>
+          <w:b/>
+          <w:sz w:val="22"/>
+        </w:rPr>
+        <w:t>not</w:t>
+      </w:r>
+      <w:r>
+        <w:rPr>
+          <w:rFonts w:ascii="Calibri" w:hAnsi="Calibri" w:eastAsia="Calibri"/>
+          <w:b w:val="0"/>
+          <w:sz w:val="22"/>
+        </w:rPr>
+        <w:t xml:space="preserve"> commit </w:t>
+      </w:r>
+      <w:r>
+        <w:rPr>
+          <w:rFonts w:ascii="Consolas" w:hAnsi="Consolas" w:eastAsia="Consolas"/>
+          <w:b w:val="0"/>
+          <w:color w:val="1E3A5F"/>
+          <w:sz w:val="18"/>
+        </w:rPr>
+        <w:t>SMTP_PASSWORD</w:t>
+      </w:r>
+      <w:r>
+        <w:rPr>
+          <w:rFonts w:ascii="Calibri" w:hAnsi="Calibri" w:eastAsia="Calibri"/>
+          <w:b w:val="0"/>
+          <w:sz w:val="22"/>
+        </w:rPr>
+        <w:t xml:space="preserve"> or </w:t>
+      </w:r>
+      <w:r>
+        <w:rPr>
+          <w:rFonts w:ascii="Consolas" w:hAnsi="Consolas" w:eastAsia="Consolas"/>
+          <w:b w:val="0"/>
+          <w:color w:val="1E3A5F"/>
+          <w:sz w:val="18"/>
+        </w:rPr>
+        <w:t>JWT_SECRET</w:t>
+      </w:r>
+      <w:r>
+        <w:rPr>
+          <w:rFonts w:ascii="Calibri" w:hAnsi="Calibri" w:eastAsia="Calibri"/>
+          <w:b w:val="0"/>
+          <w:sz w:val="22"/>
+        </w:rPr>
+        <w:t xml:space="preserve">. The Google </w:t>
+      </w:r>
+      <w:r>
+        <w:rPr>
+          <w:rFonts w:ascii="Calibri" w:hAnsi="Calibri" w:eastAsia="Calibri"/>
+          <w:b/>
+          <w:sz w:val="22"/>
+        </w:rPr>
+        <w:t>OAuth Web client ID</w:t>
+      </w:r>
+      <w:r>
+        <w:rPr>
+          <w:rFonts w:ascii="Calibri" w:hAnsi="Calibri" w:eastAsia="Calibri"/>
+          <w:b w:val="0"/>
+          <w:sz w:val="22"/>
+        </w:rPr>
+        <w:t xml:space="preserve"> is a public client identifier (safe in example files); App Passwords remain private.</w:t>
+      </w:r>
+    </w:p>
     <w:p>
       <w:pPr>
         <w:pStyle w:val="Heading2"/>
       </w:pPr>
       <w:r>
-        <w:t>Related</w:t>
+        <w:t>Artifacts</w:t>
       </w:r>
     </w:p>
-    <w:p>
-      <w:pPr>
-        <w:pStyle w:val="ListBullet"/>
-      </w:pPr>
-      <w:r>
-        <w:t xml:space="preserve">Design notes: </w:t>
-      </w:r>
-      <w:r>
-        <w:rPr>
-          <w:rFonts w:ascii="Consolas" w:hAnsi="Consolas"/>
-        </w:rPr>
-        <w:t>docs/week6/r26_r30_design.docx</w:t>
-      </w:r>
-    </w:p>
-    <w:p>
-      <w:pPr>
-        <w:pStyle w:val="ListBullet"/>
-      </w:pPr>
-      <w:r>
-        <w:t xml:space="preserve">Validation: </w:t>
-      </w:r>
-      <w:r>
-        <w:rPr>
-          <w:rFonts w:ascii="Consolas" w:hAnsi="Consolas"/>
-        </w:rPr>
-        <w:t>outputs/validation_logs/noor_week6_summary.md</w:t>
-      </w:r>
-    </w:p>
+    <w:tbl>
+      <w:tblPr>
+        <w:tblStyle w:val="TableGrid"/>
+        <w:tblW w:type="auto" w:w="0"/>
+        <w:tblLayout w:type="autofit"/>
+        <w:tblLook w:firstColumn="1" w:firstRow="1" w:lastColumn="0" w:lastRow="0" w:noHBand="0" w:noVBand="1" w:val="04A0"/>
+      </w:tblPr>
+      <w:tblGrid>
+        <w:gridCol w:w="4752"/>
+        <w:gridCol w:w="4752"/>
+      </w:tblGrid>
+      <w:tr>
+        <w:tc>
+          <w:tcPr>
+            <w:tcW w:type="dxa" w:w="4752"/>
+            <w:shd w:fill="1E3A5F" w:val="clear"/>
+          </w:tcPr>
+          <w:p>
+            <w:pPr>
+              <w:spacing w:before="60" w:after="60"/>
+            </w:pPr>
+            <w:r/>
+            <w:r>
+              <w:rPr>
+                <w:rFonts w:ascii="Calibri" w:hAnsi="Calibri" w:eastAsia="Calibri"/>
+                <w:b/>
+                <w:color w:val="FFFFFF"/>
+                <w:sz w:val="20"/>
+              </w:rPr>
+              <w:t>File</w:t>
+            </w:r>
+          </w:p>
+        </w:tc>
+        <w:tc>
+          <w:tcPr>
+            <w:tcW w:type="dxa" w:w="4752"/>
+            <w:shd w:fill="1E3A5F" w:val="clear"/>
+          </w:tcPr>
+          <w:p>
+            <w:pPr>
+              <w:spacing w:before="60" w:after="60"/>
+            </w:pPr>
+            <w:r/>
+            <w:r>
+              <w:rPr>
+                <w:rFonts w:ascii="Calibri" w:hAnsi="Calibri" w:eastAsia="Calibri"/>
+                <w:b/>
+                <w:color w:val="FFFFFF"/>
+                <w:sz w:val="20"/>
+              </w:rPr>
+              <w:t>Role</w:t>
+            </w:r>
+          </w:p>
+        </w:tc>
+      </w:tr>
+      <w:tr>
+        <w:tc>
+          <w:tcPr>
+            <w:tcW w:type="dxa" w:w="4752"/>
+          </w:tcPr>
+          <w:p>
+            <w:pPr>
+              <w:spacing w:before="60" w:after="60"/>
+            </w:pPr>
+            <w:r/>
+            <w:r>
+              <w:rPr>
+                <w:rFonts w:ascii="Consolas" w:hAnsi="Consolas" w:eastAsia="Consolas"/>
+                <w:b w:val="0"/>
+                <w:color w:val="1E3A5F"/>
+                <w:sz w:val="18"/>
+              </w:rPr>
+              <w:t>evaluation_sheet_40_screens.csv</w:t>
+            </w:r>
+          </w:p>
+        </w:tc>
+        <w:tc>
+          <w:tcPr>
+            <w:tcW w:type="dxa" w:w="4752"/>
+          </w:tcPr>
+          <w:p>
+            <w:pPr>
+              <w:spacing w:before="60" w:after="60"/>
+            </w:pPr>
+            <w:r/>
+            <w:r>
+              <w:rPr>
+                <w:rFonts w:ascii="Calibri" w:hAnsi="Calibri" w:eastAsia="Calibri"/>
+                <w:b w:val="0"/>
+                <w:sz w:val="20"/>
+              </w:rPr>
+              <w:t>Full 40-screen sheet + complete manual columns</w:t>
+            </w:r>
+          </w:p>
+        </w:tc>
+      </w:tr>
+      <w:tr>
+        <w:tc>
+          <w:tcPr>
+            <w:tcW w:type="dxa" w:w="4752"/>
+          </w:tcPr>
+          <w:p>
+            <w:pPr>
+              <w:spacing w:before="60" w:after="60"/>
+            </w:pPr>
+            <w:r/>
+            <w:r>
+              <w:rPr>
+                <w:rFonts w:ascii="Consolas" w:hAnsi="Consolas" w:eastAsia="Consolas"/>
+                <w:b w:val="0"/>
+                <w:color w:val="1E3A5F"/>
+                <w:sz w:val="18"/>
+              </w:rPr>
+              <w:t>evaluation_sheet.md</w:t>
+            </w:r>
+            <w:r>
+              <w:rPr>
+                <w:rFonts w:ascii="Calibri" w:hAnsi="Calibri" w:eastAsia="Calibri"/>
+                <w:b w:val="0"/>
+                <w:sz w:val="20"/>
+              </w:rPr>
+              <w:t xml:space="preserve"> / </w:t>
+            </w:r>
+            <w:r>
+              <w:rPr>
+                <w:rFonts w:ascii="Consolas" w:hAnsi="Consolas" w:eastAsia="Consolas"/>
+                <w:b w:val="0"/>
+                <w:color w:val="1E3A5F"/>
+                <w:sz w:val="18"/>
+              </w:rPr>
+              <w:t>.docx</w:t>
+            </w:r>
+          </w:p>
+        </w:tc>
+        <w:tc>
+          <w:tcPr>
+            <w:tcW w:type="dxa" w:w="4752"/>
+          </w:tcPr>
+          <w:p>
+            <w:pPr>
+              <w:spacing w:before="60" w:after="60"/>
+            </w:pPr>
+            <w:r/>
+            <w:r>
+              <w:rPr>
+                <w:rFonts w:ascii="Calibri" w:hAnsi="Calibri" w:eastAsia="Calibri"/>
+                <w:b w:val="0"/>
+                <w:sz w:val="20"/>
+              </w:rPr>
+              <w:t>This rationale + Week 6 companion notes</w:t>
+            </w:r>
+          </w:p>
+        </w:tc>
+      </w:tr>
+      <w:tr>
+        <w:tc>
+          <w:tcPr>
+            <w:tcW w:type="dxa" w:w="4752"/>
+          </w:tcPr>
+          <w:p>
+            <w:pPr>
+              <w:spacing w:before="60" w:after="60"/>
+            </w:pPr>
+            <w:r/>
+            <w:r>
+              <w:rPr>
+                <w:rFonts w:ascii="Consolas" w:hAnsi="Consolas" w:eastAsia="Consolas"/>
+                <w:b w:val="0"/>
+                <w:color w:val="1E3A5F"/>
+                <w:sz w:val="18"/>
+              </w:rPr>
+              <w:t>r26_r30_design.docx</w:t>
+            </w:r>
+          </w:p>
+        </w:tc>
+        <w:tc>
+          <w:tcPr>
+            <w:tcW w:type="dxa" w:w="4752"/>
+          </w:tcPr>
+          <w:p>
+            <w:pPr>
+              <w:spacing w:before="60" w:after="60"/>
+            </w:pPr>
+            <w:r/>
+            <w:r>
+              <w:rPr>
+                <w:rFonts w:ascii="Calibri" w:hAnsi="Calibri" w:eastAsia="Calibri"/>
+                <w:b w:val="0"/>
+                <w:sz w:val="20"/>
+              </w:rPr>
+              <w:t>R26–R30 design notes</w:t>
+            </w:r>
+          </w:p>
+        </w:tc>
+      </w:tr>
+      <w:tr>
+        <w:tc>
+          <w:tcPr>
+            <w:tcW w:type="dxa" w:w="4752"/>
+          </w:tcPr>
+          <w:p>
+            <w:pPr>
+              <w:spacing w:before="60" w:after="60"/>
+            </w:pPr>
+            <w:r/>
+            <w:r>
+              <w:rPr>
+                <w:rFonts w:ascii="Consolas" w:hAnsi="Consolas" w:eastAsia="Consolas"/>
+                <w:b w:val="0"/>
+                <w:color w:val="1E3A5F"/>
+                <w:sz w:val="18"/>
+              </w:rPr>
+              <w:t>../outputs/validation_logs/</w:t>
+            </w:r>
+          </w:p>
+        </w:tc>
+        <w:tc>
+          <w:tcPr>
+            <w:tcW w:type="dxa" w:w="4752"/>
+          </w:tcPr>
+          <w:p>
+            <w:pPr>
+              <w:spacing w:before="60" w:after="60"/>
+            </w:pPr>
+            <w:r/>
+            <w:r>
+              <w:rPr>
+                <w:rFonts w:ascii="Calibri" w:hAnsi="Calibri" w:eastAsia="Calibri"/>
+                <w:b w:val="0"/>
+                <w:sz w:val="20"/>
+              </w:rPr>
+              <w:t>Week 6 validation run logs + summary</w:t>
+            </w:r>
+          </w:p>
+        </w:tc>
+      </w:tr>
+    </w:tbl>
+    <w:p/>
     <w:sectPr>
       <w:pgSz w:w="12240" w:h="15840"/>
-      <w:pgMar w:top="1440" w:right="1800" w:bottom="1440" w:left="1800" w:header="720" w:footer="720" w:gutter="0"/>
+      <w:pgMar w:top="1224" w:right="1368" w:bottom="1224" w:left="1368" w:header="720" w:footer="720" w:gutter="0"/>
       <w:cols w:space="720"/>
       <w:docGrid w:linePitch="360"/>
     </w:sectPr>
@@ -783,7 +2738,7 @@
     <w:qFormat/>
     <w:rsid w:val="00FC693F"/>
     <w:pPr>
-      <w:spacing w:line="240" w:lineRule="auto"/>
+      <w:spacing w:line="240" w:lineRule="auto" w:after="120"/>
     </w:pPr>
     <w:rPr>
       <w:rFonts w:ascii="Calibri" w:hAnsi="Calibri"/>
@@ -849,11 +2804,11 @@
       <w:outlineLvl w:val="0"/>
     </w:pPr>
     <w:rPr>
-      <w:rFonts w:asciiTheme="majorHAnsi" w:eastAsiaTheme="majorEastAsia" w:hAnsiTheme="majorHAnsi" w:cstheme="majorBidi"/>
+      <w:rFonts w:asciiTheme="majorHAnsi" w:eastAsiaTheme="majorEastAsia" w:hAnsiTheme="majorHAnsi" w:cstheme="majorBidi" w:ascii="Calibri" w:hAnsi="Calibri"/>
       <w:b/>
       <w:bCs/>
-      <w:color w:val="365F91" w:themeColor="accent1" w:themeShade="BF"/>
-      <w:sz w:val="28"/>
+      <w:color w:val="1E3A5F"/>
+      <w:sz w:val="36"/>
       <w:szCs w:val="28"/>
     </w:rPr>
   </w:style>
@@ -873,11 +2828,11 @@
       <w:outlineLvl w:val="1"/>
     </w:pPr>
     <w:rPr>
-      <w:rFonts w:asciiTheme="majorHAnsi" w:eastAsiaTheme="majorEastAsia" w:hAnsiTheme="majorHAnsi" w:cstheme="majorBidi"/>
+      <w:rFonts w:asciiTheme="majorHAnsi" w:eastAsiaTheme="majorEastAsia" w:hAnsiTheme="majorHAnsi" w:cstheme="majorBidi" w:ascii="Calibri" w:hAnsi="Calibri"/>
       <w:b/>
       <w:bCs/>
-      <w:color w:val="4F81BD" w:themeColor="accent1"/>
-      <w:sz w:val="26"/>
+      <w:color w:val="1E3A5F"/>
+      <w:sz w:val="28"/>
       <w:szCs w:val="26"/>
     </w:rPr>
   </w:style>
@@ -897,10 +2852,11 @@
       <w:outlineLvl w:val="2"/>
     </w:pPr>
     <w:rPr>
-      <w:rFonts w:asciiTheme="majorHAnsi" w:eastAsiaTheme="majorEastAsia" w:hAnsiTheme="majorHAnsi" w:cstheme="majorBidi"/>
+      <w:rFonts w:asciiTheme="majorHAnsi" w:eastAsiaTheme="majorEastAsia" w:hAnsiTheme="majorHAnsi" w:cstheme="majorBidi" w:ascii="Calibri" w:hAnsi="Calibri"/>
       <w:b/>
       <w:bCs/>
-      <w:color w:val="4F81BD" w:themeColor="accent1"/>
+      <w:color w:val="1E3A5F"/>
+      <w:sz w:val="24"/>
     </w:rPr>
   </w:style>
   <w:style w:type="paragraph" w:styleId="Heading4">
@@ -920,12 +2876,13 @@
       <w:outlineLvl w:val="3"/>
     </w:pPr>
     <w:rPr>
-      <w:rFonts w:asciiTheme="majorHAnsi" w:eastAsiaTheme="majorEastAsia" w:hAnsiTheme="majorHAnsi" w:cstheme="majorBidi"/>
+      <w:rFonts w:asciiTheme="majorHAnsi" w:eastAsiaTheme="majorEastAsia" w:hAnsiTheme="majorHAnsi" w:cstheme="majorBidi" w:ascii="Calibri" w:hAnsi="Calibri"/>
       <w:b/>
       <w:bCs/>
       <w:i/>
       <w:iCs/>
-      <w:color w:val="4F81BD" w:themeColor="accent1"/>
+      <w:color w:val="1E3A5F"/>
+      <w:sz w:val="22"/>
     </w:rPr>
   </w:style>
   <w:style w:type="paragraph" w:styleId="Heading5">

</xml_diff>